<commit_message>
Második mondat hozzáadása a Word-dokumentumhoz
</commit_message>
<xml_diff>
--- a/gyakorlodokumentum.docx
+++ b/gyakorlodokumentum.docx
@@ -14,6 +14,20 @@
           <w:rFonts w:ascii="Courier New" w:hAnsi="Courier New" w:cs="Courier New"/>
         </w:rPr>
         <w:t>Ez az első Word-dokumentumom, amelynek a változásait Gittel követem.</w:t>
+      </w:r>
+    </w:p>
+    <w:p>
+      <w:pPr>
+        <w:pStyle w:val="Csakszveg"/>
+        <w:rPr>
+          <w:rFonts w:ascii="Courier New" w:hAnsi="Courier New" w:cs="Courier New"/>
+        </w:rPr>
+      </w:pPr>
+      <w:r>
+        <w:rPr>
+          <w:rFonts w:ascii="Courier New" w:hAnsi="Courier New" w:cs="Courier New"/>
+        </w:rPr>
+        <w:t>A Git ennek a dokumentumnak több változatát is meg tudja őrizni.</w:t>
       </w:r>
     </w:p>
     <w:sectPr>
@@ -430,7 +444,6 @@
   <w:style w:type="character" w:default="1" w:styleId="Bekezdsalapbettpusa">
     <w:name w:val="Default Paragraph Font"/>
     <w:uiPriority w:val="1"/>
-    <w:semiHidden/>
     <w:unhideWhenUsed/>
   </w:style>
   <w:style w:type="table" w:default="1" w:styleId="Normltblzat">

</xml_diff>

<commit_message>
Word-dokumentum visszaállítása az első változatra
</commit_message>
<xml_diff>
--- a/gyakorlodokumentum.docx
+++ b/gyakorlodokumentum.docx
@@ -14,20 +14,6 @@
           <w:rFonts w:ascii="Courier New" w:hAnsi="Courier New" w:cs="Courier New"/>
         </w:rPr>
         <w:t>Ez az első Word-dokumentumom, amelynek a változásait Gittel követem.</w:t>
-      </w:r>
-    </w:p>
-    <w:p>
-      <w:pPr>
-        <w:pStyle w:val="Csakszveg"/>
-        <w:rPr>
-          <w:rFonts w:ascii="Courier New" w:hAnsi="Courier New" w:cs="Courier New"/>
-        </w:rPr>
-      </w:pPr>
-      <w:r>
-        <w:rPr>
-          <w:rFonts w:ascii="Courier New" w:hAnsi="Courier New" w:cs="Courier New"/>
-        </w:rPr>
-        <w:t>A Git ennek a dokumentumnak több változatát is meg tudja őrizni.</w:t>
       </w:r>
     </w:p>
     <w:sectPr>
@@ -444,6 +430,7 @@
   <w:style w:type="character" w:default="1" w:styleId="Bekezdsalapbettpusa">
     <w:name w:val="Default Paragraph Font"/>
     <w:uiPriority w:val="1"/>
+    <w:semiHidden/>
     <w:unhideWhenUsed/>
   </w:style>
   <w:style w:type="table" w:default="1" w:styleId="Normltblzat">

</xml_diff>

<commit_message>
A kétmondatos Word-dokumentum visszaállítása
</commit_message>
<xml_diff>
--- a/gyakorlodokumentum.docx
+++ b/gyakorlodokumentum.docx
@@ -14,6 +14,20 @@
           <w:rFonts w:ascii="Courier New" w:hAnsi="Courier New" w:cs="Courier New"/>
         </w:rPr>
         <w:t>Ez az első Word-dokumentumom, amelynek a változásait Gittel követem.</w:t>
+      </w:r>
+    </w:p>
+    <w:p>
+      <w:pPr>
+        <w:pStyle w:val="Csakszveg"/>
+        <w:rPr>
+          <w:rFonts w:ascii="Courier New" w:hAnsi="Courier New" w:cs="Courier New"/>
+        </w:rPr>
+      </w:pPr>
+      <w:r>
+        <w:rPr>
+          <w:rFonts w:ascii="Courier New" w:hAnsi="Courier New" w:cs="Courier New"/>
+        </w:rPr>
+        <w:t>A Git ennek a dokumentumnak több változatát is meg tudja őrizni.</w:t>
       </w:r>
     </w:p>
     <w:sectPr>
@@ -430,7 +444,6 @@
   <w:style w:type="character" w:default="1" w:styleId="Bekezdsalapbettpusa">
     <w:name w:val="Default Paragraph Font"/>
     <w:uiPriority w:val="1"/>
-    <w:semiHidden/>
     <w:unhideWhenUsed/>
   </w:style>
   <w:style w:type="table" w:default="1" w:styleId="Normltblzat">

</xml_diff>